<commit_message>
Update contact phone to 17679319213 and refresh resume downloads.
Co-authored-by: Cursor <cursoragent@cursor.com>
</commit_message>
<xml_diff>
--- a/public/Java开发工程师简历--李龙飞.docx
+++ b/public/Java开发工程师简历--李龙飞.docx
@@ -1,5 +1,75 @@
 
-<file path=word/document.xml><?xml version="1.0" encoding="utf-8"?>
+<file path=customXml\item1.xml><?xml version="1.0" encoding="utf-8"?>
+<s:customData xmlns="http://www.wps.cn/officeDocument/2013/wpsCustomData" xmlns:s="http://www.wps.cn/officeDocument/2013/wpsCustomData">
+  <customSectProps>
+    <customSectPr/>
+    <customSectPr/>
+    <customSectPr/>
+    <customSectPr/>
+    <customSectPr/>
+    <customSectPr/>
+  </customSectProps>
+  <customShpExts>
+    <customShpInfo spid="_x0000_s1026"/>
+    <customShpInfo spid="_x0000_s1027"/>
+    <customShpInfo spid="_x0000_s1028"/>
+    <customShpInfo spid="_x0000_s1029"/>
+    <customShpInfo spid="_x0000_s1030"/>
+  </customShpExts>
+</s:customData>
+</file>
+
+<file path=customXml\itemProps1.xml><?xml version="1.0" encoding="utf-8"?>
+<ds:datastoreItem xmlns:ds="http://schemas.openxmlformats.org/officeDocument/2006/customXml" ds:itemID="{B1977F7D-205B-4081-913C-38D41E755F92}">
+  <ds:schemaRefs>
+    <ds:schemaRef ds:uri="http://www.wps.cn/officeDocument/2013/wpsCustomData"/>
+  </ds:schemaRefs>
+</ds:datastoreItem>
+</file>
+
+<file path=docProps\app.xml><?xml version="1.0" encoding="utf-8"?>
+<Properties xmlns="http://schemas.openxmlformats.org/officeDocument/2006/extended-properties" xmlns:vt="http://schemas.openxmlformats.org/officeDocument/2006/docPropsVTypes">
+  <Pages>4</Pages>
+  <Words>2781</Words>
+  <Characters>3705</Characters>
+  <TotalTime>1</TotalTime>
+  <ScaleCrop>false</ScaleCrop>
+  <LinksUpToDate>false</LinksUpToDate>
+  <CharactersWithSpaces>4344</CharactersWithSpaces>
+  <Application>WPS Office_12.1.0.26895_F1E327BC-269C-435d-A152-05C5408002CA</Application>
+</Properties>
+</file>
+
+<file path=docProps\core.xml><?xml version="1.0" encoding="utf-8"?>
+<cp:coreProperties xmlns:cp="http://schemas.openxmlformats.org/package/2006/metadata/core-properties" xmlns:dc="http://purl.org/dc/elements/1.1/" xmlns:dcterms="http://purl.org/dc/terms/" xmlns:dcmitype="http://purl.org/dc/dcmitype/" xmlns:xsi="http://www.w3.org/2001/XMLSchema-instance">
+  <dcterms:created xsi:type="dcterms:W3CDTF">2023-11-22T22:29:00Z</dcterms:created>
+  <dc:creator>Administrator</dc:creator>
+  <cp:lastModifiedBy>君の名は</cp:lastModifiedBy>
+  <dcterms:modified xsi:type="dcterms:W3CDTF">2026-07-25T23:32:14Z</dcterms:modified>
+</cp:coreProperties>
+</file>
+
+<file path=docProps\custom.xml><?xml version="1.0" encoding="utf-8"?>
+<Properties xmlns="http://schemas.openxmlformats.org/officeDocument/2006/custom-properties" xmlns:vt="http://schemas.openxmlformats.org/officeDocument/2006/docPropsVTypes">
+  <property fmtid="{D5CDD505-2E9C-101B-9397-08002B2CF9AE}" pid="2" name="CRO">
+    <vt:lpwstr>wqlLaW5nc29mdCBQREYgdG8gV1BTIDkw</vt:lpwstr>
+  </property>
+  <property fmtid="{D5CDD505-2E9C-101B-9397-08002B2CF9AE}" pid="3" name="Created">
+    <vt:filetime>2023-11-22T22:29:20Z</vt:filetime>
+  </property>
+  <property fmtid="{D5CDD505-2E9C-101B-9397-08002B2CF9AE}" pid="4" name="KSOProductBuildVer">
+    <vt:lpwstr>2052-12.1.0.26895</vt:lpwstr>
+  </property>
+  <property fmtid="{D5CDD505-2E9C-101B-9397-08002B2CF9AE}" pid="5" name="ICV">
+    <vt:lpwstr>30FB1242074C47468B83250304DC6766_12</vt:lpwstr>
+  </property>
+  <property fmtid="{D5CDD505-2E9C-101B-9397-08002B2CF9AE}" pid="6" name="KSOTemplateDocerSaveRecord">
+    <vt:lpwstr>eyJoZGlkIjoiZmM0Njk0NjYxMDhkMjM3YWYwZDgxMzA1ZjMxNjg0NDYiLCJ1c2VySWQiOiI0MzkyNzM4ODkifQ==</vt:lpwstr>
+  </property>
+</Properties>
+</file>
+
+<file path=word\document.xml><?xml version="1.0" encoding="utf-8"?>
 <w:document xmlns:wpc="http://schemas.microsoft.com/office/word/2010/wordprocessingCanvas" xmlns:mc="http://schemas.openxmlformats.org/markup-compatibility/2006" xmlns:o="urn:schemas-microsoft-com:office:office" xmlns:r="http://schemas.openxmlformats.org/officeDocument/2006/relationships" xmlns:m="http://schemas.openxmlformats.org/officeDocument/2006/math" xmlns:v="urn:schemas-microsoft-com:vml" xmlns:wp14="http://schemas.microsoft.com/office/word/2010/wordprocessingDrawing" xmlns:wp="http://schemas.openxmlformats.org/drawingml/2006/wordprocessingDrawing" xmlns:w="http://schemas.openxmlformats.org/wordprocessingml/2006/main" xmlns:w14="http://schemas.microsoft.com/office/word/2010/wordml" xmlns:w10="urn:schemas-microsoft-com:office:word" xmlns:w15="http://schemas.microsoft.com/office/word/2012/wordml" xmlns:wpg="http://schemas.microsoft.com/office/word/2010/wordprocessingGroup" xmlns:wpi="http://schemas.microsoft.com/office/word/2010/wordprocessingInk" xmlns:wne="http://schemas.microsoft.com/office/word/2006/wordml" xmlns:wps="http://schemas.microsoft.com/office/word/2010/wordprocessingShape" xmlns:wpsCustomData="http://www.wps.cn/officeDocument/2013/wpsCustomData" mc:Ignorable="w14 w15 wp14">
   <w:body>
     <w:p>
@@ -554,11 +624,14 @@
       </w:r>
       <w:r>
         <w:rPr>
+          <w:rFonts w:hint="eastAsia"/>
           <w:color w:val="3F3F3F"/>
           <w:spacing w:val="5"/>
         </w:rPr>
-        <w:t>15565040817</w:t>
-      </w:r>
+        <w:t>17679319213</w:t>
+      </w:r>
+      <w:bookmarkStart w:id="1" w:name="_GoBack"/>
+      <w:bookmarkEnd w:id="1"/>
     </w:p>
     <w:p>
       <w:pPr>
@@ -579,7 +652,7 @@
         <w:fldChar w:fldCharType="begin"/>
       </w:r>
       <w:r>
-        <w:instrText xml:space="preserve"> HYPERLINK "mailto:15565040817@163.com" </w:instrText>
+        <w:instrText xml:space="preserve"> HYPERLINK "mailto:17679319213@163.com" </w:instrText>
       </w:r>
       <w:r>
         <w:fldChar w:fldCharType="separate"/>
@@ -590,7 +663,7 @@
           <w:spacing w:val="2"/>
           <w:u w:val="single" w:color="auto"/>
         </w:rPr>
-        <w:t>15565040817@163.</w:t>
+        <w:t>17679319213@163.</w:t>
       </w:r>
       <w:r>
         <w:rPr>
@@ -655,7 +728,7 @@
         <w:fldChar w:fldCharType="begin"/>
       </w:r>
       <w:r>
-        <w:instrText xml:space="preserve"> HYPERLINK "mailto:15565040817@163.com" </w:instrText>
+        <w:instrText xml:space="preserve"> HYPERLINK "mailto:17679319213@163.com" </w:instrText>
       </w:r>
       <w:r>
         <w:fldChar w:fldCharType="separate"/>
@@ -1571,6 +1644,25 @@
           </w14:textOutline>
         </w:rPr>
         <w:tab/>
+      </w:r>
+      <w:r>
+        <w:rPr>
+          <w:rFonts w:hint="eastAsia" w:eastAsia="宋体"/>
+          <w:b/>
+          <w:bCs/>
+          <w:color w:val="FFFFFF"/>
+          <w:spacing w:val="6"/>
+          <w:sz w:val="24"/>
+          <w:szCs w:val="24"/>
+          <w:lang w:val="en-US" w:eastAsia="zh-CN"/>
+          <w14:textOutline w14:w="4540" w14:cap="sq" w14:cmpd="sng">
+            <w14:solidFill>
+              <w14:srgbClr w14:val="FFFFFF"/>
+            </w14:solidFill>
+            <w14:prstDash w14:val="solid"/>
+            <w14:bevel/>
+          </w14:textOutline>
+        </w:rPr>
         <w:t xml:space="preserve">    </w:t>
       </w:r>
       <w:r>
@@ -1693,7 +1785,6 @@
           </w14:textOutline>
         </w:rPr>
         <w:tab/>
-        <w:t/>
       </w:r>
       <w:r>
         <w:rPr>
@@ -1714,7 +1805,6 @@
           </w14:textOutline>
         </w:rPr>
         <w:tab/>
-        <w:t/>
       </w:r>
       <w:r>
         <w:rPr>
@@ -1735,7 +1825,6 @@
           </w14:textOutline>
         </w:rPr>
         <w:tab/>
-        <w:t/>
       </w:r>
       <w:r>
         <w:rPr>
@@ -1756,7 +1845,6 @@
           </w14:textOutline>
         </w:rPr>
         <w:tab/>
-        <w:t/>
       </w:r>
       <w:r>
         <w:rPr>
@@ -1777,7 +1865,6 @@
           </w14:textOutline>
         </w:rPr>
         <w:tab/>
-        <w:t/>
       </w:r>
       <w:r>
         <w:rPr>
@@ -1798,7 +1885,6 @@
           </w14:textOutline>
         </w:rPr>
         <w:tab/>
-        <w:t/>
       </w:r>
       <w:r>
         <w:rPr>
@@ -1819,7 +1905,6 @@
           </w14:textOutline>
         </w:rPr>
         <w:tab/>
-        <w:t/>
       </w:r>
       <w:r>
         <w:rPr>
@@ -1840,7 +1925,6 @@
           </w14:textOutline>
         </w:rPr>
         <w:tab/>
-        <w:t/>
       </w:r>
       <w:r>
         <w:rPr>
@@ -1861,7 +1945,6 @@
           </w14:textOutline>
         </w:rPr>
         <w:tab/>
-        <w:t/>
       </w:r>
       <w:r>
         <w:rPr>
@@ -1882,7 +1965,6 @@
           </w14:textOutline>
         </w:rPr>
         <w:tab/>
-        <w:t/>
       </w:r>
       <w:r>
         <w:rPr>
@@ -1903,7 +1985,6 @@
           </w14:textOutline>
         </w:rPr>
         <w:tab/>
-        <w:t/>
       </w:r>
       <w:r>
         <w:rPr>
@@ -2306,6 +2387,7 @@
       <w:pPr>
         <w:pStyle w:val="2"/>
         <w:numPr>
+          <w:ilvl w:val="0"/>
           <w:numId w:val="0"/>
         </w:numPr>
         <w:tabs>
@@ -2494,8 +2576,6 @@
         </w:rPr>
         <w:t>1.8 等</w:t>
       </w:r>
-      <w:bookmarkStart w:id="1" w:name="_GoBack"/>
-      <w:bookmarkEnd w:id="1"/>
     </w:p>
     <w:p>
       <w:pPr>
@@ -4870,14 +4950,7 @@
           <w:color w:val="3F3F3F"/>
           <w:spacing w:val="7"/>
         </w:rPr>
-        <w:t xml:space="preserve">. </w:t>
-      </w:r>
-      <w:r>
-        <w:rPr>
-          <w:color w:val="3F3F3F"/>
-          <w:spacing w:val="7"/>
-        </w:rPr>
-        <w:t>负责用户登录包括注册业务。</w:t>
+        <w:t>. 负责用户登录包括注册业务。</w:t>
       </w:r>
     </w:p>
     <w:p>
@@ -6481,7 +6554,7 @@
 </w:document>
 </file>
 
-<file path=word/endnotes.xml><?xml version="1.0" encoding="utf-8"?>
+<file path=word\endnotes.xml><?xml version="1.0" encoding="utf-8"?>
 <w:endnotes xmlns:wpc="http://schemas.microsoft.com/office/word/2010/wordprocessingCanvas" xmlns:mc="http://schemas.openxmlformats.org/markup-compatibility/2006" xmlns:o="urn:schemas-microsoft-com:office:office" xmlns:r="http://schemas.openxmlformats.org/officeDocument/2006/relationships" xmlns:m="http://schemas.openxmlformats.org/officeDocument/2006/math" xmlns:v="urn:schemas-microsoft-com:vml" xmlns:wp14="http://schemas.microsoft.com/office/word/2010/wordprocessingDrawing" xmlns:wp="http://schemas.openxmlformats.org/drawingml/2006/wordprocessingDrawing" xmlns:w="http://schemas.openxmlformats.org/wordprocessingml/2006/main" xmlns:w14="http://schemas.microsoft.com/office/word/2010/wordml" xmlns:w15="http://schemas.microsoft.com/office/word/2012/wordml" xmlns:w10="urn:schemas-microsoft-com:office:word" xmlns:wpg="http://schemas.microsoft.com/office/word/2010/wordprocessingGroup" xmlns:wpi="http://schemas.microsoft.com/office/word/2010/wordprocessingInk" xmlns:wne="http://schemas.microsoft.com/office/word/2006/wordml" xmlns:wps="http://schemas.microsoft.com/office/word/2010/wordprocessingShape" xmlns:wpsCustomData="http://www.wps.cn/officeDocument/2013/wpsCustomData" mc:Ignorable="w14 w15 wp14">
   <w:endnote w:type="separator" w:id="0">
     <w:p>
@@ -6506,7 +6579,83 @@
 </w:endnotes>
 </file>
 
-<file path=word/footnotes.xml><?xml version="1.0" encoding="utf-8"?>
+<file path=word\fontTable.xml><?xml version="1.0" encoding="utf-8"?>
+<w:fonts xmlns:mc="http://schemas.openxmlformats.org/markup-compatibility/2006" xmlns:r="http://schemas.openxmlformats.org/officeDocument/2006/relationships" xmlns:w="http://schemas.openxmlformats.org/wordprocessingml/2006/main" xmlns:w14="http://schemas.microsoft.com/office/word/2010/wordml" mc:Ignorable="w14">
+  <w:font w:name="Times New Roman">
+    <w:panose1 w:val="02020603050405020304"/>
+    <w:charset w:val="00"/>
+    <w:family w:val="roman"/>
+    <w:pitch w:val="variable"/>
+    <w:sig w:usb0="20007A87" w:usb1="80000000" w:usb2="00000008" w:usb3="00000000" w:csb0="000001FF" w:csb1="00000000"/>
+  </w:font>
+  <w:font w:name="宋体">
+    <w:panose1 w:val="02010600030101010101"/>
+    <w:charset w:val="86"/>
+    <w:family w:val="auto"/>
+    <w:pitch w:val="default"/>
+    <w:sig w:usb0="00000203" w:usb1="288F0000" w:usb2="00000006" w:usb3="00000000" w:csb0="00040001" w:csb1="00000000"/>
+  </w:font>
+  <w:font w:name="Wingdings">
+    <w:panose1 w:val="05000000000000000000"/>
+    <w:charset w:val="02"/>
+    <w:family w:val="auto"/>
+    <w:pitch w:val="default"/>
+    <w:sig w:usb0="00000000" w:usb1="00000000" w:usb2="00000000" w:usb3="00000000" w:csb0="80000000" w:csb1="00000000"/>
+  </w:font>
+  <w:font w:name="Arial">
+    <w:panose1 w:val="020B0604020202020204"/>
+    <w:charset w:val="01"/>
+    <w:family w:val="swiss"/>
+    <w:pitch w:val="default"/>
+    <w:sig w:usb0="E0002EFF" w:usb1="C000785B" w:usb2="00000009" w:usb3="00000000" w:csb0="400001FF" w:csb1="FFFF0000"/>
+  </w:font>
+  <w:font w:name="黑体">
+    <w:panose1 w:val="02010609060101010101"/>
+    <w:charset w:val="86"/>
+    <w:family w:val="auto"/>
+    <w:pitch w:val="default"/>
+    <w:sig w:usb0="800002BF" w:usb1="38CF7CFA" w:usb2="00000016" w:usb3="00000000" w:csb0="00040001" w:csb1="00000000"/>
+  </w:font>
+  <w:font w:name="Courier New">
+    <w:panose1 w:val="02070309020205020404"/>
+    <w:charset w:val="01"/>
+    <w:family w:val="modern"/>
+    <w:pitch w:val="default"/>
+    <w:sig w:usb0="E0002EFF" w:usb1="C0007843" w:usb2="00000009" w:usb3="00000000" w:csb0="400001FF" w:csb1="FFFF0000"/>
+  </w:font>
+  <w:font w:name="Symbol">
+    <w:panose1 w:val="05050102010706020507"/>
+    <w:charset w:val="02"/>
+    <w:family w:val="roman"/>
+    <w:pitch w:val="default"/>
+    <w:sig w:usb0="00000000" w:usb1="00000000" w:usb2="00000000" w:usb3="00000000" w:csb0="80000000" w:csb1="00000000"/>
+  </w:font>
+  <w:font w:name="Calibri">
+    <w:panose1 w:val="020F0502020204030204"/>
+    <w:charset w:val="00"/>
+    <w:family w:val="swiss"/>
+    <w:pitch w:val="default"/>
+    <w:sig w:usb0="E4002EFF" w:usb1="C200247B" w:usb2="00000009" w:usb3="00000000" w:csb0="200001FF" w:csb1="00000000"/>
+  </w:font>
+  <w:font w:name="微软雅黑">
+    <w:panose1 w:val="020B0503020204020204"/>
+    <w:charset w:val="86"/>
+    <w:family w:val="auto"/>
+    <w:pitch w:val="default"/>
+    <w:sig w:usb0="80000287" w:usb1="2ACF3C50" w:usb2="00000016" w:usb3="00000000" w:csb0="0004001F" w:csb1="00000000"/>
+  </w:font>
+  <w:font w:name="Times">
+    <w:altName w:val="Times New Roman"/>
+    <w:panose1 w:val="00000000000000000000"/>
+    <w:charset w:val="00"/>
+    <w:family w:val="auto"/>
+    <w:pitch w:val="default"/>
+    <w:sig w:usb0="00000000" w:usb1="00000000" w:usb2="00000000" w:usb3="00000000" w:csb0="00000000" w:csb1="00000000"/>
+  </w:font>
+</w:fonts>
+</file>
+
+<file path=word\footnotes.xml><?xml version="1.0" encoding="utf-8"?>
 <w:footnotes xmlns:wpc="http://schemas.microsoft.com/office/word/2010/wordprocessingCanvas" xmlns:mc="http://schemas.openxmlformats.org/markup-compatibility/2006" xmlns:o="urn:schemas-microsoft-com:office:office" xmlns:r="http://schemas.openxmlformats.org/officeDocument/2006/relationships" xmlns:m="http://schemas.openxmlformats.org/officeDocument/2006/math" xmlns:v="urn:schemas-microsoft-com:vml" xmlns:wp14="http://schemas.microsoft.com/office/word/2010/wordprocessingDrawing" xmlns:wp="http://schemas.openxmlformats.org/drawingml/2006/wordprocessingDrawing" xmlns:w="http://schemas.openxmlformats.org/wordprocessingml/2006/main" xmlns:w14="http://schemas.microsoft.com/office/word/2010/wordml" xmlns:w15="http://schemas.microsoft.com/office/word/2012/wordml" xmlns:w10="urn:schemas-microsoft-com:office:word" xmlns:wpg="http://schemas.microsoft.com/office/word/2010/wordprocessingGroup" xmlns:wpi="http://schemas.microsoft.com/office/word/2010/wordprocessingInk" xmlns:wne="http://schemas.microsoft.com/office/word/2006/wordml" xmlns:wps="http://schemas.microsoft.com/office/word/2010/wordprocessingShape" xmlns:wpsCustomData="http://www.wps.cn/officeDocument/2013/wpsCustomData" mc:Ignorable="w14 w15 wp14">
   <w:footnote w:type="separator" w:id="0">
     <w:p>
@@ -6531,7 +6680,7 @@
 </w:footnotes>
 </file>
 
-<file path=word/header1.xml><?xml version="1.0" encoding="utf-8"?>
+<file path=word\header1.xml><?xml version="1.0" encoding="utf-8"?>
 <w:hdr xmlns:wpc="http://schemas.microsoft.com/office/word/2010/wordprocessingCanvas" xmlns:mc="http://schemas.openxmlformats.org/markup-compatibility/2006" xmlns:o="urn:schemas-microsoft-com:office:office" xmlns:r="http://schemas.openxmlformats.org/officeDocument/2006/relationships" xmlns:m="http://schemas.openxmlformats.org/officeDocument/2006/math" xmlns:v="urn:schemas-microsoft-com:vml" xmlns:wp14="http://schemas.microsoft.com/office/word/2010/wordprocessingDrawing" xmlns:wp="http://schemas.openxmlformats.org/drawingml/2006/wordprocessingDrawing" xmlns:w10="urn:schemas-microsoft-com:office:word" xmlns:w="http://schemas.openxmlformats.org/wordprocessingml/2006/main" xmlns:w14="http://schemas.microsoft.com/office/word/2010/wordml" xmlns:w15="http://schemas.microsoft.com/office/word/2012/wordml" xmlns:wpg="http://schemas.microsoft.com/office/word/2010/wordprocessingGroup" xmlns:wpi="http://schemas.microsoft.com/office/word/2010/wordprocessingInk" xmlns:wne="http://schemas.microsoft.com/office/word/2006/wordml" xmlns:wps="http://schemas.microsoft.com/office/word/2010/wordprocessingShape" xmlns:wpsCustomData="http://www.wps.cn/officeDocument/2013/wpsCustomData" mc:Ignorable="w14 w15 wp14">
   <w:p>
     <w:pPr>
@@ -6588,7 +6737,7 @@
 </w:hdr>
 </file>
 
-<file path=word/header2.xml><?xml version="1.0" encoding="utf-8"?>
+<file path=word\header2.xml><?xml version="1.0" encoding="utf-8"?>
 <w:hdr xmlns:wpc="http://schemas.microsoft.com/office/word/2010/wordprocessingCanvas" xmlns:mc="http://schemas.openxmlformats.org/markup-compatibility/2006" xmlns:o="urn:schemas-microsoft-com:office:office" xmlns:r="http://schemas.openxmlformats.org/officeDocument/2006/relationships" xmlns:m="http://schemas.openxmlformats.org/officeDocument/2006/math" xmlns:v="urn:schemas-microsoft-com:vml" xmlns:wp14="http://schemas.microsoft.com/office/word/2010/wordprocessingDrawing" xmlns:wp="http://schemas.openxmlformats.org/drawingml/2006/wordprocessingDrawing" xmlns:w10="urn:schemas-microsoft-com:office:word" xmlns:w="http://schemas.openxmlformats.org/wordprocessingml/2006/main" xmlns:w14="http://schemas.microsoft.com/office/word/2010/wordml" xmlns:w15="http://schemas.microsoft.com/office/word/2012/wordml" xmlns:wpg="http://schemas.microsoft.com/office/word/2010/wordprocessingGroup" xmlns:wpi="http://schemas.microsoft.com/office/word/2010/wordprocessingInk" xmlns:wne="http://schemas.microsoft.com/office/word/2006/wordml" xmlns:wps="http://schemas.microsoft.com/office/word/2010/wordprocessingShape" xmlns:wpsCustomData="http://www.wps.cn/officeDocument/2013/wpsCustomData" mc:Ignorable="w14 w15 wp14">
   <w:p>
     <w:pPr>
@@ -6602,7 +6751,7 @@
 </w:hdr>
 </file>
 
-<file path=word/numbering.xml><?xml version="1.0" encoding="utf-8"?>
+<file path=word\numbering.xml><?xml version="1.0" encoding="utf-8"?>
 <w:numbering xmlns:wpc="http://schemas.microsoft.com/office/word/2010/wordprocessingCanvas" xmlns:mc="http://schemas.openxmlformats.org/markup-compatibility/2006" xmlns:o="urn:schemas-microsoft-com:office:office" xmlns:r="http://schemas.openxmlformats.org/officeDocument/2006/relationships" xmlns:m="http://schemas.openxmlformats.org/officeDocument/2006/math" xmlns:v="urn:schemas-microsoft-com:vml" xmlns:wp14="http://schemas.microsoft.com/office/word/2010/wordprocessingDrawing" xmlns:wp="http://schemas.openxmlformats.org/drawingml/2006/wordprocessingDrawing" xmlns:w10="urn:schemas-microsoft-com:office:word" xmlns:w="http://schemas.openxmlformats.org/wordprocessingml/2006/main" xmlns:w14="http://schemas.microsoft.com/office/word/2010/wordml" xmlns:wpg="http://schemas.microsoft.com/office/word/2010/wordprocessingGroup" xmlns:wpi="http://schemas.microsoft.com/office/word/2010/wordprocessingInk" xmlns:wne="http://schemas.microsoft.com/office/word/2006/wordml" xmlns:wps="http://schemas.microsoft.com/office/word/2010/wordprocessingShape" xmlns:wpsCustomData="http://www.wps.cn/officeDocument/2013/wpsCustomData" mc:Ignorable="w14 wp14">
   <w:abstractNum w:abstractNumId="0">
     <w:nsid w:val="8E583EFE"/>
@@ -6630,7 +6779,201 @@
 </w:numbering>
 </file>
 
-<file path=word/styles.xml><?xml version="1.0" encoding="utf-8"?>
+<file path=word\settings.xml><?xml version="1.0" encoding="utf-8"?>
+<w:settings xmlns:mc="http://schemas.openxmlformats.org/markup-compatibility/2006" xmlns:o="urn:schemas-microsoft-com:office:office" xmlns:r="http://schemas.openxmlformats.org/officeDocument/2006/relationships" xmlns:m="http://schemas.openxmlformats.org/officeDocument/2006/math" xmlns:v="urn:schemas-microsoft-com:vml" xmlns:w10="urn:schemas-microsoft-com:office:word" xmlns:w="http://schemas.openxmlformats.org/wordprocessingml/2006/main" xmlns:w14="http://schemas.microsoft.com/office/word/2010/wordml" xmlns:sl="http://schemas.openxmlformats.org/schemaLibrary/2006/main" xmlns:wpsCustomData="http://www.wps.cn/officeDocument/2013/wpsCustomData" mc:Ignorable="w14">
+  <w:zoom w:percent="100"/>
+  <w:displayBackgroundShape w:val="1"/>
+  <w:bordersDoNotSurroundHeader w:val="0"/>
+  <w:bordersDoNotSurroundFooter w:val="0"/>
+  <w:documentProtection w:enforcement="0"/>
+  <w:displayHorizontalDrawingGridEvery w:val="1"/>
+  <w:displayVerticalDrawingGridEvery w:val="1"/>
+  <w:noPunctuationKerning w:val="1"/>
+  <w:characterSpacingControl w:val="doNotCompress"/>
+  <w:hdrShapeDefaults>
+    <o:shapelayout v:ext="edit">
+      <o:idmap v:ext="edit" data="2"/>
+    </o:shapelayout>
+  </w:hdrShapeDefaults>
+  <w:footnotePr>
+    <w:footnote w:id="0"/>
+    <w:footnote w:id="1"/>
+  </w:footnotePr>
+  <w:endnotePr>
+    <w:endnote w:id="0"/>
+    <w:endnote w:id="1"/>
+  </w:endnotePr>
+  <w:compat>
+    <w:spaceForUL/>
+    <w:ulTrailSpace/>
+    <w:doNotExpandShiftReturn/>
+    <w:doNotWrapTextWithPunct/>
+    <w:doNotUseEastAsianBreakRules/>
+    <w:useFELayout/>
+    <w:doNotUseIndentAsNumberingTabStop/>
+    <w:compatSetting w:name="compatibilityMode" w:uri="http://schemas.microsoft.com/office/word" w:val="14"/>
+  </w:compat>
+  <w:docVars>
+    <w:docVar w:name="commondata" w:val="eyJoZGlkIjoiMjkwNTJmY2E3ZWI5NTRjMjIwMGRhODZlMTE0YWYxNzcifQ=="/>
+  </w:docVars>
+  <w:rsids>
+    <w:rsidRoot w:val="00000000"/>
+    <w:rsid w:val="00302ABE"/>
+    <w:rsid w:val="035E381E"/>
+    <w:rsid w:val="04001E75"/>
+    <w:rsid w:val="04DF55EA"/>
+    <w:rsid w:val="0511564D"/>
+    <w:rsid w:val="059F2E09"/>
+    <w:rsid w:val="06F51363"/>
+    <w:rsid w:val="07391925"/>
+    <w:rsid w:val="0AAA48E8"/>
+    <w:rsid w:val="0DFA59FC"/>
+    <w:rsid w:val="0E161082"/>
+    <w:rsid w:val="0E5F2D35"/>
+    <w:rsid w:val="0EB9159E"/>
+    <w:rsid w:val="0FAD093E"/>
+    <w:rsid w:val="10CA7A92"/>
+    <w:rsid w:val="112E1DCF"/>
+    <w:rsid w:val="12900868"/>
+    <w:rsid w:val="145E333E"/>
+    <w:rsid w:val="163A0E50"/>
+    <w:rsid w:val="181D494B"/>
+    <w:rsid w:val="1891299B"/>
+    <w:rsid w:val="19322678"/>
+    <w:rsid w:val="1C2404CD"/>
+    <w:rsid w:val="1CC7757C"/>
+    <w:rsid w:val="1CD13F56"/>
+    <w:rsid w:val="1CDE33D3"/>
+    <w:rsid w:val="1DE2466D"/>
+    <w:rsid w:val="22F10EAE"/>
+    <w:rsid w:val="230B6414"/>
+    <w:rsid w:val="23AC3027"/>
+    <w:rsid w:val="24480FA2"/>
+    <w:rsid w:val="25A80649"/>
+    <w:rsid w:val="274B7250"/>
+    <w:rsid w:val="284E0B51"/>
+    <w:rsid w:val="28975CD4"/>
+    <w:rsid w:val="2943504D"/>
+    <w:rsid w:val="2944442E"/>
+    <w:rsid w:val="29E76B67"/>
+    <w:rsid w:val="2B037255"/>
+    <w:rsid w:val="2B564AEE"/>
+    <w:rsid w:val="2B575615"/>
+    <w:rsid w:val="2B844FB6"/>
+    <w:rsid w:val="2DAF61AA"/>
+    <w:rsid w:val="2DB875AF"/>
+    <w:rsid w:val="2E092D17"/>
+    <w:rsid w:val="2E4D203A"/>
+    <w:rsid w:val="30FD3114"/>
+    <w:rsid w:val="321150C9"/>
+    <w:rsid w:val="327A5DC3"/>
+    <w:rsid w:val="33574D5E"/>
+    <w:rsid w:val="3373534D"/>
+    <w:rsid w:val="337D5EB4"/>
+    <w:rsid w:val="33C10429"/>
+    <w:rsid w:val="34A75871"/>
+    <w:rsid w:val="35956011"/>
+    <w:rsid w:val="35A40002"/>
+    <w:rsid w:val="35C12962"/>
+    <w:rsid w:val="36F01751"/>
+    <w:rsid w:val="38C2077F"/>
+    <w:rsid w:val="3C6D114E"/>
+    <w:rsid w:val="3F125371"/>
+    <w:rsid w:val="3F5623A8"/>
+    <w:rsid w:val="3FF419EC"/>
+    <w:rsid w:val="405014B2"/>
+    <w:rsid w:val="40546021"/>
+    <w:rsid w:val="40AF61D9"/>
+    <w:rsid w:val="421D53C4"/>
+    <w:rsid w:val="42741C6E"/>
+    <w:rsid w:val="433335B3"/>
+    <w:rsid w:val="43361207"/>
+    <w:rsid w:val="434B2F45"/>
+    <w:rsid w:val="44190722"/>
+    <w:rsid w:val="45943232"/>
+    <w:rsid w:val="47CF53B3"/>
+    <w:rsid w:val="481A73B7"/>
+    <w:rsid w:val="48432644"/>
+    <w:rsid w:val="496F7A57"/>
+    <w:rsid w:val="4A6873F9"/>
+    <w:rsid w:val="4F7D5BB3"/>
+    <w:rsid w:val="4FC773EB"/>
+    <w:rsid w:val="523C1E38"/>
+    <w:rsid w:val="524B3888"/>
+    <w:rsid w:val="53400F13"/>
+    <w:rsid w:val="546D21DB"/>
+    <w:rsid w:val="560B1CAC"/>
+    <w:rsid w:val="563D798B"/>
+    <w:rsid w:val="564A4DFD"/>
+    <w:rsid w:val="581A5FE1"/>
+    <w:rsid w:val="58533496"/>
+    <w:rsid w:val="58B06B3A"/>
+    <w:rsid w:val="58C61EBA"/>
+    <w:rsid w:val="5A49344D"/>
+    <w:rsid w:val="5A9A1850"/>
+    <w:rsid w:val="5C193FF5"/>
+    <w:rsid w:val="5C292008"/>
+    <w:rsid w:val="5CAF15C5"/>
+    <w:rsid w:val="5CF04391"/>
+    <w:rsid w:val="5E2751A9"/>
+    <w:rsid w:val="5E2C395E"/>
+    <w:rsid w:val="5E6C52B2"/>
+    <w:rsid w:val="61FB0274"/>
+    <w:rsid w:val="62E418BB"/>
+    <w:rsid w:val="635158D4"/>
+    <w:rsid w:val="67B11F87"/>
+    <w:rsid w:val="69A51678"/>
+    <w:rsid w:val="6A6D2745"/>
+    <w:rsid w:val="6CA83959"/>
+    <w:rsid w:val="6D1F2A93"/>
+    <w:rsid w:val="6ED95EDE"/>
+    <w:rsid w:val="6F925F92"/>
+    <w:rsid w:val="70910843"/>
+    <w:rsid w:val="70E138DD"/>
+    <w:rsid w:val="70FC24C5"/>
+    <w:rsid w:val="713F0604"/>
+    <w:rsid w:val="73326672"/>
+    <w:rsid w:val="77B92437"/>
+    <w:rsid w:val="781C224F"/>
+    <w:rsid w:val="78223B6F"/>
+    <w:rsid w:val="782C7B34"/>
+    <w:rsid w:val="783C3345"/>
+    <w:rsid w:val="78EF12F4"/>
+    <w:rsid w:val="7B5D6256"/>
+    <w:rsid w:val="7C773348"/>
+  </w:rsids>
+  <m:mathPr>
+    <m:brkBin m:val="before"/>
+    <m:brkBinSub m:val="--"/>
+    <m:smallFrac m:val="0"/>
+    <m:dispDef/>
+    <m:lMargin m:val="0"/>
+    <m:rMargin m:val="0"/>
+    <m:defJc m:val="centerGroup"/>
+    <m:wrapIndent m:val="1440"/>
+    <m:intLim m:val="subSup"/>
+    <m:naryLim m:val="undOvr"/>
+  </m:mathPr>
+  <w:themeFontLang w:val="en-US" w:eastAsia="zh-CN"/>
+  <w:clrSchemeMapping w:bg1="light1" w:t1="dark1" w:bg2="light2" w:t2="dark2" w:accent1="accent1" w:accent2="accent2" w:accent3="accent3" w:accent4="accent4" w:accent5="accent5" w:accent6="accent6" w:hyperlink="hyperlink" w:followedHyperlink="followedHyperlink"/>
+  <w:shapeDefaults>
+    <o:shapedefaults fillcolor="#FFFFFF" fill="t" stroke="t">
+      <v:fill on="t" focussize="0,0"/>
+      <v:stroke color="#000000"/>
+    </o:shapedefaults>
+    <o:shapelayout v:ext="edit">
+      <o:idmap v:ext="edit" data="1"/>
+    </o:shapelayout>
+  </w:shapeDefaults>
+  <mc:AlternateContent>
+    <mc:Choice Requires="wpsCustomData">
+      <wpsCustomData:typoFeatureVersion val="1"/>
+    </mc:Choice>
+  </mc:AlternateContent>
+</w:settings>
+</file>
+
+<file path=word\styles.xml><?xml version="1.0" encoding="utf-8"?>
 <w:styles xmlns:mc="http://schemas.openxmlformats.org/markup-compatibility/2006" xmlns:o="urn:schemas-microsoft-com:office:office" xmlns:r="http://schemas.openxmlformats.org/officeDocument/2006/relationships" xmlns:m="http://schemas.openxmlformats.org/officeDocument/2006/math" xmlns:v="urn:schemas-microsoft-com:vml" xmlns:w="http://schemas.openxmlformats.org/wordprocessingml/2006/main" xmlns:w14="http://schemas.microsoft.com/office/word/2010/wordml" xmlns:w10="urn:schemas-microsoft-com:office:word" xmlns:sl="http://schemas.openxmlformats.org/schemaLibrary/2006/main" xmlns:wpsCustomData="http://www.wps.cn/officeDocument/2013/wpsCustomData" mc:Ignorable="w14">
   <w:docDefaults>
     <w:rPrDefault>
@@ -6995,7 +7338,7 @@
 </w:styles>
 </file>
 
-<file path=word/theme/theme1.xml><?xml version="1.0" encoding="utf-8"?>
+<file path=word\theme\theme1.xml><?xml version="1.0" encoding="utf-8"?>
 <a:theme xmlns:a="http://schemas.openxmlformats.org/drawingml/2006/main" name="Office">
   <a:themeElements>
     <a:clrScheme name="Office">
@@ -7277,32 +7620,4 @@
   </a:themeElements>
   <a:objectDefaults/>
 </a:theme>
-</file>
-
-<file path=customXml/item1.xml><?xml version="1.0" encoding="utf-8"?>
-<s:customData xmlns="http://www.wps.cn/officeDocument/2013/wpsCustomData" xmlns:s="http://www.wps.cn/officeDocument/2013/wpsCustomData">
-  <customSectProps>
-    <customSectPr/>
-    <customSectPr/>
-    <customSectPr/>
-    <customSectPr/>
-    <customSectPr/>
-    <customSectPr/>
-  </customSectProps>
-  <customShpExts>
-    <customShpInfo spid="_x0000_s1026"/>
-    <customShpInfo spid="_x0000_s1027"/>
-    <customShpInfo spid="_x0000_s1028"/>
-    <customShpInfo spid="_x0000_s1029"/>
-    <customShpInfo spid="_x0000_s1030"/>
-  </customShpExts>
-</s:customData>
-</file>
-
-<file path=customXml/itemProps1.xml><?xml version="1.0" encoding="utf-8"?>
-<ds:datastoreItem xmlns:ds="http://schemas.openxmlformats.org/officeDocument/2006/customXml" ds:itemID="{B1977F7D-205B-4081-913C-38D41E755F92}">
-  <ds:schemaRefs>
-    <ds:schemaRef ds:uri="http://www.wps.cn/officeDocument/2013/wpsCustomData"/>
-  </ds:schemaRefs>
-</ds:datastoreItem>
 </file>
</xml_diff>